<commit_message>
Drop negative scope from freelance resume
Co-authored-by: dimonix2019 <dimonix2019@users.noreply.github.com>
</commit_message>
<xml_diff>
--- a/Abramov_DN_resume_FREELANCE.docx
+++ b/Abramov_DN_resume_FREELANCE.docx
@@ -385,7 +385,7 @@
     </w:p>
     <w:p>
       <w:r>
-        <w:t>Помогаю компаниям и командам быстро получить рабочий аналитический результат: потребность → метрики и методика → прототип/дашборд или требования к витрине → постановка и приёмка. Опыт в Сбере, банке ПСБ и консалтинге (Axenix): управленческая отчётность, BI-дашборды (в том числе в Сбере сам был инициатором создания дашбордов), контуры данных и согласование с ИТ/ИБ. Ищу короткие понятные проекты с фиксированным результатом, без роли «тушения всех пожаров».</w:t>
+        <w:t>Помогаю компаниям и командам быстро получить рабочий аналитический результат: потребность → метрики и методика → прототип/дашборд или требования к витрине → постановка и приёмка. Опыт в Сбере, банке ПСБ и консалтинге (Axenix): управленческая отчётность, BI-дашборды (в том числе в Сбере сам был инициатором создания дашбордов), контуры данных и согласование с ИТ/ИБ.</w:t>
       </w:r>
     </w:p>
     <w:p>
@@ -406,16 +406,6 @@
     <w:p>
       <w:r>
         <w:t>1) Дашборд под задачу бизнеса: метрики, структура экранов, макет/реализация на вашей BI-платформе, внедрение в использование. 2) Витрина/отчётность: формализация требований к данным, методика расчёта, постановка и приёмка поставки. 3) Аудит текущих дашбордов: что мешает пользоваться, приоритизация доработок, план улучшений на 30–60 дней.</w:t>
-      </w:r>
-    </w:p>
-    <w:p>
-      <w:r>
-        <w:t>Не беру в одиночку</w:t>
-      </w:r>
-    </w:p>
-    <w:p>
-      <w:r>
-        <w:t>Полное создание корпоративного хранилища «под ключ», круглосуточную координацию множества стримов и роль единственного руководителя по всем направлениям сразу.</w:t>
       </w:r>
     </w:p>
     <w:p/>

</xml_diff>

<commit_message>
Make freelance resume read more natural, short hyphens
Co-authored-by: dimonix2019 <dimonix2019@users.noreply.github.com>
</commit_message>
<xml_diff>
--- a/Abramov_DN_resume_FREELANCE.docx
+++ b/Abramov_DN_resume_FREELANCE.docx
@@ -68,7 +68,7 @@
           <w:color w:val="222222"/>
           <w:sz w:val="21"/>
         </w:rPr>
-        <w:t>abramov</w:t>
+        <w:t>abramov-dn@yandex.ru - предпочитаемый способ связи</w:t>
       </w:r>
       <w:proofErr w:type="spellEnd"/>
       <w:r>
@@ -78,7 +78,6 @@
           <w:sz w:val="21"/>
           <w:lang w:val="ru-RU"/>
         </w:rPr>
-        <w:t>-</w:t>
       </w:r>
       <w:proofErr w:type="spellStart"/>
       <w:r>
@@ -87,7 +86,6 @@
           <w:color w:val="222222"/>
           <w:sz w:val="21"/>
         </w:rPr>
-        <w:t>dn</w:t>
       </w:r>
       <w:proofErr w:type="spellEnd"/>
       <w:r>
@@ -97,7 +95,6 @@
           <w:sz w:val="21"/>
           <w:lang w:val="ru-RU"/>
         </w:rPr>
-        <w:t>@</w:t>
       </w:r>
       <w:proofErr w:type="spellStart"/>
       <w:r>
@@ -106,7 +103,6 @@
           <w:color w:val="222222"/>
           <w:sz w:val="21"/>
         </w:rPr>
-        <w:t>yandex</w:t>
       </w:r>
       <w:proofErr w:type="spellEnd"/>
       <w:r>
@@ -116,7 +112,6 @@
           <w:sz w:val="21"/>
           <w:lang w:val="ru-RU"/>
         </w:rPr>
-        <w:t>.</w:t>
       </w:r>
       <w:proofErr w:type="spellStart"/>
       <w:r>
@@ -125,7 +120,6 @@
           <w:color w:val="222222"/>
           <w:sz w:val="21"/>
         </w:rPr>
-        <w:t>ru</w:t>
       </w:r>
       <w:proofErr w:type="spellEnd"/>
       <w:r>
@@ -135,7 +129,6 @@
           <w:sz w:val="21"/>
           <w:lang w:val="ru-RU"/>
         </w:rPr>
-        <w:t xml:space="preserve"> — предпочитаемый способ связи</w:t>
       </w:r>
     </w:p>
     <w:p>
@@ -225,7 +218,7 @@
           <w:sz w:val="24"/>
           <w:lang w:val="ru-RU"/>
         </w:rPr>
-        <w:t>Эксперт / консультант по дашбордам, витринам и управленческой отчётности (проектная работа)</w:t>
+        <w:t>Консультант по дашбордам и управленческой отчётности (проекты)</w:t>
       </w:r>
       <w:r>
         <w:rPr>
@@ -284,7 +277,7 @@
           <w:sz w:val="20"/>
           <w:lang w:val="ru-RU"/>
         </w:rPr>
-        <w:t>—  Консультант по аналитике / дашбордам / витринам (проектно)</w:t>
+        <w:t>- Консультант по аналитике, дашбордам, витринам</w:t>
       </w:r>
       <w:r>
         <w:rPr>
@@ -323,7 +316,7 @@
           <w:sz w:val="20"/>
           <w:lang w:val="ru-RU"/>
         </w:rPr>
-        <w:t>Тип занятости: проектная / частичная занятость, разовые и короткие контракты</w:t>
+        <w:t>Тип занятости: проектная работа, частичная занятость</w:t>
       </w:r>
     </w:p>
     <w:p>
@@ -340,7 +333,7 @@
           <w:sz w:val="20"/>
           <w:lang w:val="ru-RU"/>
         </w:rPr>
-        <w:t>Формат работы: удалённо (предпочтительно), гибрид по договорённости</w:t>
+        <w:t>Формат работы: удалённо, при необходимости гибрид</w:t>
       </w:r>
     </w:p>
     <w:p>
@@ -374,7 +367,7 @@
           <w:color w:val="222222"/>
           <w:lang w:val="ru-RU"/>
         </w:rPr>
-        <w:t>Ориентир: проекты 80–150 тыс. ₽ / этап; пакет из 2–3 проектов или ставка по договорённости</w:t>
+        <w:t>Ориентир по проекту: 80-150 тыс. руб. за этап. Несколько проектов или ставка - по договорённости</w:t>
       </w:r>
     </w:p>
     <w:p/>
@@ -385,27 +378,27 @@
     </w:p>
     <w:p>
       <w:r>
-        <w:t>Помогаю компаниям и командам быстро получить рабочий аналитический результат: потребность → метрики и методика → прототип/дашборд или требования к витрине → постановка и приёмка. Опыт в Сбере, банке ПСБ и консалтинге (Axenix): управленческая отчётность, BI-дашборды (в том числе в Сбере сам был инициатором создания дашбордов), контуры данных и согласование с ИТ/ИБ.</w:t>
+        <w:t>Собираю аналитику до рабочего экрана: задача, метрики, данные, дашборд или требования к витрине, приёмка. Работал в Сбере, ПСБ и Axenix - управленческая отчётность, BI. В Сбере сам инициировал создание дашбордов. Есть опыт по хранилищам и согласованию с ИТ и ИБ.</w:t>
       </w:r>
     </w:p>
     <w:p>
       <w:r>
-        <w:t>Формат работы со мной</w:t>
+        <w:t>Как работаю</w:t>
       </w:r>
     </w:p>
     <w:p>
       <w:r>
-        <w:t>• Фиксированный скоуп и срок (обычно 2–6 недель на этап). • Один понятный артефакт на выходе: дашборд / ТЗ+прототип / реестр метрик / приёмка. • Удалённо, асинхронно; созвоны по повестке, не ежедневный операционный контур. • Могу подключаться как эксперт рядом с вашей командой разработки/аналитики.</w:t>
+        <w:t>Беру понятный кусок на 2-6 недель. На выходе - дашборд, ТЗ с прототипом или приёмка. Удалённо, созвоны по делу. Могу работать вместе с вашей аналитикой или разработкой.</w:t>
       </w:r>
     </w:p>
     <w:p>
       <w:r>
-        <w:t>Типовые проекты (ориентир 80–150 тыс. ₽ за этап)</w:t>
+        <w:t>Какие проекты беру (ориентир 80-150 тыс. руб. за этап)</w:t>
       </w:r>
     </w:p>
     <w:p>
       <w:r>
-        <w:t>1) Дашборд под задачу бизнеса: метрики, структура экранов, макет/реализация на вашей BI-платформе, внедрение в использование. 2) Витрина/отчётность: формализация требований к данным, методика расчёта, постановка и приёмка поставки. 3) Аудит текущих дашбордов: что мешает пользоваться, приоритизация доработок, план улучшений на 30–60 дней.</w:t>
+        <w:t>1) Дашборд под задачу: метрики, экраны, сборка на вашей BI, чтобы им пользовались. 2) Витрина и отчётность: методика, требования к данным, постановка, приёмка. 3) Разбор текущих дашбордов: почему не живут, что чинить первым, план на месяц-два.</w:t>
       </w:r>
     </w:p>
     <w:p/>
@@ -427,7 +420,7 @@
           <w:sz w:val="26"/>
           <w:lang w:val="ru-RU"/>
         </w:rPr>
-        <w:t>Опыт работы — 24 года 6 месяцев</w:t>
+        <w:t>Опыт работы - 24 года 6 месяцев</w:t>
       </w:r>
     </w:p>
     <w:p>
@@ -445,7 +438,7 @@
           <w:sz w:val="20"/>
           <w:lang w:val="ru-RU"/>
         </w:rPr>
-        <w:t>Ноябрь 2024 — настоящее время</w:t>
+        <w:t>Ноябрь 2024 - настоящее время    1 год 9 месяцев</w:t>
       </w:r>
       <w:r>
         <w:rPr>
@@ -454,7 +447,6 @@
           <w:sz w:val="19"/>
           <w:lang w:val="ru-RU"/>
         </w:rPr>
-        <w:t xml:space="preserve">    1 год 9 месяцев</w:t>
       </w:r>
     </w:p>
     <w:p>
@@ -740,7 +732,7 @@
           <w:sz w:val="20"/>
           <w:lang w:val="ru-RU"/>
         </w:rPr>
-        <w:t>Собрана и развивается кросс-функциональная команда (бизнес, ИТ, подрядчики): подбор, распределение ресурсов, координация работ.</w:t>
+        <w:t>Собрал команду (бизнес, ИТ, подрядчики): подбор, загрузка, координация.</w:t>
       </w:r>
     </w:p>
     <w:p>
@@ -758,7 +750,7 @@
           <w:sz w:val="20"/>
           <w:lang w:val="ru-RU"/>
         </w:rPr>
-        <w:t xml:space="preserve">Финансы и закупки проекта; контроль бюджета, рисков и </w:t>
+        <w:t>Финансы и закупки, бюджет, риски, состав работ, статус перед бизнесом.</w:t>
       </w:r>
       <w:proofErr w:type="spellStart"/>
       <w:r>
@@ -768,7 +760,6 @@
           <w:sz w:val="20"/>
           <w:lang w:val="ru-RU"/>
         </w:rPr>
-        <w:t>скоупа</w:t>
       </w:r>
       <w:proofErr w:type="spellEnd"/>
       <w:r>
@@ -778,7 +769,6 @@
           <w:sz w:val="20"/>
           <w:lang w:val="ru-RU"/>
         </w:rPr>
-        <w:t>; защита статуса перед бизнесом.</w:t>
       </w:r>
     </w:p>
     <w:p>
@@ -796,92 +786,82 @@
           <w:sz w:val="20"/>
           <w:lang w:val="ru-RU"/>
         </w:rPr>
-        <w:t xml:space="preserve">Согласованы ключевые документы (цели, </w:t>
-      </w:r>
-      <w:r>
-        <w:rPr>
-          <w:rFonts w:ascii="Arial" w:eastAsia="Arial" w:hAnsi="Arial"/>
-          <w:color w:val="222222"/>
-          <w:sz w:val="20"/>
-        </w:rPr>
-        <w:t>RoadMap</w:t>
-      </w:r>
-      <w:r>
-        <w:rPr>
-          <w:rFonts w:ascii="Arial" w:eastAsia="Arial" w:hAnsi="Arial"/>
-          <w:color w:val="222222"/>
-          <w:sz w:val="20"/>
-          <w:lang w:val="ru-RU"/>
-        </w:rPr>
-        <w:t xml:space="preserve">, концептуальный дизайн, БТ, ТЗ) с ИТ, ИБ и бизнесом; совместно со </w:t>
-      </w:r>
-      <w:r>
-        <w:rPr>
-          <w:rFonts w:ascii="Arial" w:eastAsia="Arial" w:hAnsi="Arial"/>
-          <w:color w:val="222222"/>
-          <w:sz w:val="20"/>
-        </w:rPr>
-        <w:t>Scrum</w:t>
-      </w:r>
-      <w:r>
-        <w:rPr>
-          <w:rFonts w:ascii="Arial" w:eastAsia="Arial" w:hAnsi="Arial"/>
-          <w:color w:val="222222"/>
-          <w:sz w:val="20"/>
-          <w:lang w:val="ru-RU"/>
-        </w:rPr>
-        <w:t xml:space="preserve">-мастером внедрены </w:t>
-      </w:r>
-      <w:r>
-        <w:rPr>
-          <w:rFonts w:ascii="Arial" w:eastAsia="Arial" w:hAnsi="Arial"/>
-          <w:color w:val="222222"/>
-          <w:sz w:val="20"/>
-        </w:rPr>
-        <w:t>Agile</w:t>
-      </w:r>
-      <w:r>
-        <w:rPr>
-          <w:rFonts w:ascii="Arial" w:eastAsia="Arial" w:hAnsi="Arial"/>
-          <w:color w:val="222222"/>
-          <w:sz w:val="20"/>
-          <w:lang w:val="ru-RU"/>
-        </w:rPr>
-        <w:t xml:space="preserve">-процессы; организован </w:t>
-      </w:r>
-      <w:r>
-        <w:rPr>
-          <w:rFonts w:ascii="Arial" w:eastAsia="Arial" w:hAnsi="Arial"/>
-          <w:color w:val="222222"/>
-          <w:sz w:val="20"/>
-        </w:rPr>
-        <w:t>CI</w:t>
-      </w:r>
-      <w:r>
-        <w:rPr>
-          <w:rFonts w:ascii="Arial" w:eastAsia="Arial" w:hAnsi="Arial"/>
-          <w:color w:val="222222"/>
-          <w:sz w:val="20"/>
-          <w:lang w:val="ru-RU"/>
-        </w:rPr>
-        <w:t>/</w:t>
-      </w:r>
-      <w:r>
-        <w:rPr>
-          <w:rFonts w:ascii="Arial" w:eastAsia="Arial" w:hAnsi="Arial"/>
-          <w:color w:val="222222"/>
-          <w:sz w:val="20"/>
-        </w:rPr>
-        <w:t>CD</w:t>
-      </w:r>
-      <w:r>
-        <w:rPr>
-          <w:rFonts w:ascii="Arial" w:eastAsia="Arial" w:hAnsi="Arial"/>
-          <w:color w:val="222222"/>
-          <w:sz w:val="20"/>
-          <w:lang w:val="ru-RU"/>
-        </w:rPr>
-        <w:t>.</w:t>
+        <w:t>Согласовал цели, дорожную карту, концепт, БТ и ТЗ с ИТ, ИБ и бизнесом. Вместе со Scrum-мастером настроили рабочий процесс, есть CI/CD.</w:t>
+      </w:r>
+      <w:r>
+        <w:rPr>
+          <w:rFonts w:ascii="Arial" w:eastAsia="Arial" w:hAnsi="Arial"/>
+          <w:color w:val="222222"/>
+          <w:sz w:val="20"/>
+        </w:rPr>
+      </w:r>
+      <w:r>
+        <w:rPr>
+          <w:rFonts w:ascii="Arial" w:eastAsia="Arial" w:hAnsi="Arial"/>
+          <w:color w:val="222222"/>
+          <w:sz w:val="20"/>
+          <w:lang w:val="ru-RU"/>
+        </w:rPr>
+      </w:r>
+      <w:r>
+        <w:rPr>
+          <w:rFonts w:ascii="Arial" w:eastAsia="Arial" w:hAnsi="Arial"/>
+          <w:color w:val="222222"/>
+          <w:sz w:val="20"/>
+        </w:rPr>
+      </w:r>
+      <w:r>
+        <w:rPr>
+          <w:rFonts w:ascii="Arial" w:eastAsia="Arial" w:hAnsi="Arial"/>
+          <w:color w:val="222222"/>
+          <w:sz w:val="20"/>
+          <w:lang w:val="ru-RU"/>
+        </w:rPr>
+      </w:r>
+      <w:r>
+        <w:rPr>
+          <w:rFonts w:ascii="Arial" w:eastAsia="Arial" w:hAnsi="Arial"/>
+          <w:color w:val="222222"/>
+          <w:sz w:val="20"/>
+        </w:rPr>
+      </w:r>
+      <w:r>
+        <w:rPr>
+          <w:rFonts w:ascii="Arial" w:eastAsia="Arial" w:hAnsi="Arial"/>
+          <w:color w:val="222222"/>
+          <w:sz w:val="20"/>
+          <w:lang w:val="ru-RU"/>
+        </w:rPr>
+      </w:r>
+      <w:r>
+        <w:rPr>
+          <w:rFonts w:ascii="Arial" w:eastAsia="Arial" w:hAnsi="Arial"/>
+          <w:color w:val="222222"/>
+          <w:sz w:val="20"/>
+        </w:rPr>
+      </w:r>
+      <w:r>
+        <w:rPr>
+          <w:rFonts w:ascii="Arial" w:eastAsia="Arial" w:hAnsi="Arial"/>
+          <w:color w:val="222222"/>
+          <w:sz w:val="20"/>
+          <w:lang w:val="ru-RU"/>
+        </w:rPr>
+      </w:r>
+      <w:r>
+        <w:rPr>
+          <w:rFonts w:ascii="Arial" w:eastAsia="Arial" w:hAnsi="Arial"/>
+          <w:color w:val="222222"/>
+          <w:sz w:val="20"/>
+        </w:rPr>
+      </w:r>
+      <w:r>
+        <w:rPr>
+          <w:rFonts w:ascii="Arial" w:eastAsia="Arial" w:hAnsi="Arial"/>
+          <w:color w:val="222222"/>
+          <w:sz w:val="20"/>
+          <w:lang w:val="ru-RU"/>
+        </w:rPr>
       </w:r>
     </w:p>
     <w:p>
@@ -1030,58 +1010,52 @@
           <w:sz w:val="20"/>
           <w:lang w:val="ru-RU"/>
         </w:rPr>
-        <w:t xml:space="preserve">Контроль скоупа, рисков и сроков; защита проекта перед бизнесом; </w:t>
-      </w:r>
-      <w:r>
-        <w:rPr>
-          <w:rFonts w:ascii="Arial" w:eastAsia="Arial" w:hAnsi="Arial"/>
-          <w:color w:val="222222"/>
-          <w:sz w:val="20"/>
-        </w:rPr>
-        <w:t>RoadMap</w:t>
-      </w:r>
-      <w:r>
-        <w:rPr>
-          <w:rFonts w:ascii="Arial" w:eastAsia="Arial" w:hAnsi="Arial"/>
-          <w:color w:val="222222"/>
-          <w:sz w:val="20"/>
-          <w:lang w:val="ru-RU"/>
-        </w:rPr>
-        <w:t xml:space="preserve"> и проектные документы; развитие </w:t>
-      </w:r>
-      <w:r>
-        <w:rPr>
-          <w:rFonts w:ascii="Arial" w:eastAsia="Arial" w:hAnsi="Arial"/>
-          <w:color w:val="222222"/>
-          <w:sz w:val="20"/>
-        </w:rPr>
-        <w:t>CI</w:t>
-      </w:r>
-      <w:r>
-        <w:rPr>
-          <w:rFonts w:ascii="Arial" w:eastAsia="Arial" w:hAnsi="Arial"/>
-          <w:color w:val="222222"/>
-          <w:sz w:val="20"/>
-          <w:lang w:val="ru-RU"/>
-        </w:rPr>
-        <w:t>/</w:t>
-      </w:r>
-      <w:r>
-        <w:rPr>
-          <w:rFonts w:ascii="Arial" w:eastAsia="Arial" w:hAnsi="Arial"/>
-          <w:color w:val="222222"/>
-          <w:sz w:val="20"/>
-        </w:rPr>
-        <w:t>CD</w:t>
-      </w:r>
-      <w:r>
-        <w:rPr>
-          <w:rFonts w:ascii="Arial" w:eastAsia="Arial" w:hAnsi="Arial"/>
-          <w:color w:val="222222"/>
-          <w:sz w:val="20"/>
-          <w:lang w:val="ru-RU"/>
-        </w:rPr>
-        <w:t>.</w:t>
+        <w:t>Состав работ, риски, сроки; статус перед бизнесом; дорожная карта и документы; CI/CD.</w:t>
+      </w:r>
+      <w:r>
+        <w:rPr>
+          <w:rFonts w:ascii="Arial" w:eastAsia="Arial" w:hAnsi="Arial"/>
+          <w:color w:val="222222"/>
+          <w:sz w:val="20"/>
+        </w:rPr>
+      </w:r>
+      <w:r>
+        <w:rPr>
+          <w:rFonts w:ascii="Arial" w:eastAsia="Arial" w:hAnsi="Arial"/>
+          <w:color w:val="222222"/>
+          <w:sz w:val="20"/>
+          <w:lang w:val="ru-RU"/>
+        </w:rPr>
+      </w:r>
+      <w:r>
+        <w:rPr>
+          <w:rFonts w:ascii="Arial" w:eastAsia="Arial" w:hAnsi="Arial"/>
+          <w:color w:val="222222"/>
+          <w:sz w:val="20"/>
+        </w:rPr>
+      </w:r>
+      <w:r>
+        <w:rPr>
+          <w:rFonts w:ascii="Arial" w:eastAsia="Arial" w:hAnsi="Arial"/>
+          <w:color w:val="222222"/>
+          <w:sz w:val="20"/>
+          <w:lang w:val="ru-RU"/>
+        </w:rPr>
+      </w:r>
+      <w:r>
+        <w:rPr>
+          <w:rFonts w:ascii="Arial" w:eastAsia="Arial" w:hAnsi="Arial"/>
+          <w:color w:val="222222"/>
+          <w:sz w:val="20"/>
+        </w:rPr>
+      </w:r>
+      <w:r>
+        <w:rPr>
+          <w:rFonts w:ascii="Arial" w:eastAsia="Arial" w:hAnsi="Arial"/>
+          <w:color w:val="222222"/>
+          <w:sz w:val="20"/>
+          <w:lang w:val="ru-RU"/>
+        </w:rPr>
       </w:r>
     </w:p>
     <w:p>
@@ -1099,7 +1073,7 @@
           <w:sz w:val="20"/>
           <w:lang w:val="ru-RU"/>
         </w:rPr>
-        <w:t>Сентябрь 2022 — Ноябрь 2024</w:t>
+        <w:t>Сентябрь 2022 - Ноябрь 2024    2 года 3 месяца</w:t>
       </w:r>
       <w:r>
         <w:rPr>
@@ -1108,7 +1082,6 @@
           <w:sz w:val="19"/>
           <w:lang w:val="ru-RU"/>
         </w:rPr>
-        <w:t xml:space="preserve">    2 года 3 месяца</w:t>
       </w:r>
     </w:p>
     <w:p>
@@ -1278,42 +1251,37 @@
           <w:sz w:val="20"/>
           <w:lang w:val="ru-RU"/>
         </w:rPr>
-        <w:lastRenderedPageBreak/>
-        <w:t xml:space="preserve">Построена система управленческой отчётности и </w:t>
-      </w:r>
-      <w:r>
-        <w:rPr>
-          <w:rFonts w:ascii="Arial" w:eastAsia="Arial" w:hAnsi="Arial"/>
-          <w:color w:val="222222"/>
-          <w:sz w:val="20"/>
-        </w:rPr>
-        <w:t>BI</w:t>
-      </w:r>
-      <w:r>
-        <w:rPr>
-          <w:rFonts w:ascii="Arial" w:eastAsia="Arial" w:hAnsi="Arial"/>
-          <w:color w:val="222222"/>
-          <w:sz w:val="20"/>
-          <w:lang w:val="ru-RU"/>
-        </w:rPr>
-        <w:t xml:space="preserve"> для топ-менеджмента крупнейшего металлургического комбината России (НЛМК) на платформе Форсайт — дашборды, </w:t>
-      </w:r>
-      <w:r>
-        <w:rPr>
-          <w:rFonts w:ascii="Arial" w:eastAsia="Arial" w:hAnsi="Arial"/>
-          <w:color w:val="222222"/>
-          <w:sz w:val="20"/>
-        </w:rPr>
-        <w:t>KPI</w:t>
-      </w:r>
-      <w:r>
-        <w:rPr>
-          <w:rFonts w:ascii="Arial" w:eastAsia="Arial" w:hAnsi="Arial"/>
-          <w:color w:val="222222"/>
-          <w:sz w:val="20"/>
-          <w:lang w:val="ru-RU"/>
-        </w:rPr>
-        <w:t>, регулярная аналитика; в контуре дашбордов использованы модели ИИ для оценки и прогнозирования показателей.</w:t>
+        <w:t>Построена система управленческой отчётности и BI для топ-менеджмента крупнейшего металлургического комбината России (НЛМК) на платформе Форсайт - дашборды, KPI, регулярная аналитика; в контуре дашбордов использованы модели ИИ для оценки и прогнозирования показателей.</w:t>
+      </w:r>
+      <w:r>
+        <w:rPr>
+          <w:rFonts w:ascii="Arial" w:eastAsia="Arial" w:hAnsi="Arial"/>
+          <w:color w:val="222222"/>
+          <w:sz w:val="20"/>
+        </w:rPr>
+      </w:r>
+      <w:r>
+        <w:rPr>
+          <w:rFonts w:ascii="Arial" w:eastAsia="Arial" w:hAnsi="Arial"/>
+          <w:color w:val="222222"/>
+          <w:sz w:val="20"/>
+          <w:lang w:val="ru-RU"/>
+        </w:rPr>
+      </w:r>
+      <w:r>
+        <w:rPr>
+          <w:rFonts w:ascii="Arial" w:eastAsia="Arial" w:hAnsi="Arial"/>
+          <w:color w:val="222222"/>
+          <w:sz w:val="20"/>
+        </w:rPr>
+      </w:r>
+      <w:r>
+        <w:rPr>
+          <w:rFonts w:ascii="Arial" w:eastAsia="Arial" w:hAnsi="Arial"/>
+          <w:color w:val="222222"/>
+          <w:sz w:val="20"/>
+          <w:lang w:val="ru-RU"/>
+        </w:rPr>
       </w:r>
     </w:p>
     <w:p>
@@ -1331,24 +1299,22 @@
           <w:sz w:val="20"/>
           <w:lang w:val="ru-RU"/>
         </w:rPr>
-        <w:t xml:space="preserve">Выведены </w:t>
-      </w:r>
-      <w:r>
-        <w:rPr>
-          <w:rFonts w:ascii="Arial" w:eastAsia="Arial" w:hAnsi="Arial"/>
-          <w:color w:val="222222"/>
-          <w:sz w:val="20"/>
-        </w:rPr>
-        <w:t>BI</w:t>
-      </w:r>
-      <w:r>
-        <w:rPr>
-          <w:rFonts w:ascii="Arial" w:eastAsia="Arial" w:hAnsi="Arial"/>
-          <w:color w:val="222222"/>
-          <w:sz w:val="20"/>
-          <w:lang w:val="ru-RU"/>
-        </w:rPr>
-        <w:t>-продукты: потребности заказчика → метрики → дашборды с применением моделей ИИ (оценка и прогноз) → приёмка и обратная связь.</w:t>
+        <w:t>Выводил BI: потребность заказчика, метрики, дашборды (в т.ч. оценка и прогноз на моделях ИИ), приёмка и правки по обратной связи.</w:t>
+      </w:r>
+      <w:r>
+        <w:rPr>
+          <w:rFonts w:ascii="Arial" w:eastAsia="Arial" w:hAnsi="Arial"/>
+          <w:color w:val="222222"/>
+          <w:sz w:val="20"/>
+        </w:rPr>
+      </w:r>
+      <w:r>
+        <w:rPr>
+          <w:rFonts w:ascii="Arial" w:eastAsia="Arial" w:hAnsi="Arial"/>
+          <w:color w:val="222222"/>
+          <w:sz w:val="20"/>
+          <w:lang w:val="ru-RU"/>
+        </w:rPr>
       </w:r>
     </w:p>
     <w:p>
@@ -1366,7 +1332,7 @@
           <w:sz w:val="20"/>
           <w:lang w:val="ru-RU"/>
         </w:rPr>
-        <w:t>Организована работа проектной команды вокруг ценности для заказчика: экраны, метрики, регулярная отчётность.</w:t>
+        <w:t>Команду держал на экранах и метриках, которые заказчику реально нужны, а не на бесконечной постановке.</w:t>
       </w:r>
     </w:p>
     <w:p>
@@ -1398,41 +1364,37 @@
           <w:sz w:val="20"/>
           <w:lang w:val="ru-RU"/>
         </w:rPr>
-        <w:t xml:space="preserve">Построение систем управленческой отчётности и </w:t>
-      </w:r>
-      <w:r>
-        <w:rPr>
-          <w:rFonts w:ascii="Arial" w:eastAsia="Arial" w:hAnsi="Arial"/>
-          <w:color w:val="222222"/>
-          <w:sz w:val="20"/>
-        </w:rPr>
-        <w:t>BI</w:t>
-      </w:r>
-      <w:r>
-        <w:rPr>
-          <w:rFonts w:ascii="Arial" w:eastAsia="Arial" w:hAnsi="Arial"/>
-          <w:color w:val="222222"/>
-          <w:sz w:val="20"/>
-          <w:lang w:val="ru-RU"/>
-        </w:rPr>
-        <w:t xml:space="preserve">: </w:t>
-      </w:r>
-      <w:r>
-        <w:rPr>
-          <w:rFonts w:ascii="Arial" w:eastAsia="Arial" w:hAnsi="Arial"/>
-          <w:color w:val="222222"/>
-          <w:sz w:val="20"/>
-        </w:rPr>
-        <w:t>discovery</w:t>
-      </w:r>
-      <w:r>
-        <w:rPr>
-          <w:rFonts w:ascii="Arial" w:eastAsia="Arial" w:hAnsi="Arial"/>
-          <w:color w:val="222222"/>
-          <w:sz w:val="20"/>
-          <w:lang w:val="ru-RU"/>
-        </w:rPr>
-        <w:t>, проектирование дашбордов, интеграция моделей ИИ для оценки и прогноза, постановка, приёмка.</w:t>
+        <w:t>Управленческая отчётность и BI: разбор задачи, дашборды, модели ИИ для оценки и прогноза, постановка, приёмка.</w:t>
+      </w:r>
+      <w:r>
+        <w:rPr>
+          <w:rFonts w:ascii="Arial" w:eastAsia="Arial" w:hAnsi="Arial"/>
+          <w:color w:val="222222"/>
+          <w:sz w:val="20"/>
+        </w:rPr>
+      </w:r>
+      <w:r>
+        <w:rPr>
+          <w:rFonts w:ascii="Arial" w:eastAsia="Arial" w:hAnsi="Arial"/>
+          <w:color w:val="222222"/>
+          <w:sz w:val="20"/>
+          <w:lang w:val="ru-RU"/>
+        </w:rPr>
+      </w:r>
+      <w:r>
+        <w:rPr>
+          <w:rFonts w:ascii="Arial" w:eastAsia="Arial" w:hAnsi="Arial"/>
+          <w:color w:val="222222"/>
+          <w:sz w:val="20"/>
+        </w:rPr>
+      </w:r>
+      <w:r>
+        <w:rPr>
+          <w:rFonts w:ascii="Arial" w:eastAsia="Arial" w:hAnsi="Arial"/>
+          <w:color w:val="222222"/>
+          <w:sz w:val="20"/>
+          <w:lang w:val="ru-RU"/>
+        </w:rPr>
       </w:r>
     </w:p>
     <w:p>
@@ -1503,7 +1465,7 @@
           <w:sz w:val="20"/>
           <w:lang w:val="ru-RU"/>
         </w:rPr>
-        <w:t>Август 2016 — Сентябрь 2022</w:t>
+        <w:t>Август 2016 - Сентябрь 2022    6 лет 2 месяца</w:t>
       </w:r>
       <w:r>
         <w:rPr>
@@ -1512,7 +1474,6 @@
           <w:sz w:val="19"/>
           <w:lang w:val="ru-RU"/>
         </w:rPr>
-        <w:t xml:space="preserve">    6 лет 2 месяца</w:t>
       </w:r>
     </w:p>
     <w:p>
@@ -1916,24 +1877,22 @@
           <w:sz w:val="20"/>
           <w:lang w:val="ru-RU"/>
         </w:rPr>
-        <w:t xml:space="preserve">Создана база знаний Программы «Создание Фабрики Данных»; на </w:t>
-      </w:r>
-      <w:r>
-        <w:rPr>
-          <w:rFonts w:ascii="Arial" w:eastAsia="Arial" w:hAnsi="Arial"/>
-          <w:color w:val="222222"/>
-          <w:sz w:val="20"/>
-        </w:rPr>
-        <w:t>QlikView</w:t>
-      </w:r>
-      <w:r>
-        <w:rPr>
-          <w:rFonts w:ascii="Arial" w:eastAsia="Arial" w:hAnsi="Arial"/>
-          <w:color w:val="222222"/>
-          <w:sz w:val="20"/>
-          <w:lang w:val="ru-RU"/>
-        </w:rPr>
-        <w:t xml:space="preserve"> — дашборд по базе знаний (Управление ресурсами, Управление инициативами, Управление коллегиальными органами и др.).</w:t>
+        <w:t>Создана база знаний Программы «Создание Фабрики Данных»; на QlikView - дашборд по базе знаний (Управление ресурсами, Управление инициативами, Управление коллегиальными органами и др.).</w:t>
+      </w:r>
+      <w:r>
+        <w:rPr>
+          <w:rFonts w:ascii="Arial" w:eastAsia="Arial" w:hAnsi="Arial"/>
+          <w:color w:val="222222"/>
+          <w:sz w:val="20"/>
+        </w:rPr>
+      </w:r>
+      <w:r>
+        <w:rPr>
+          <w:rFonts w:ascii="Arial" w:eastAsia="Arial" w:hAnsi="Arial"/>
+          <w:color w:val="222222"/>
+          <w:sz w:val="20"/>
+          <w:lang w:val="ru-RU"/>
+        </w:rPr>
       </w:r>
     </w:p>
     <w:p>
@@ -2054,7 +2013,7 @@
           <w:sz w:val="20"/>
           <w:lang w:val="ru-RU"/>
         </w:rPr>
-        <w:t>Развитие продуктовых контуров отчётности и мониторинга: дашборды, бэклог, приёмка, обратная связь.</w:t>
+        <w:t>Вёл отчётность и мониторинг: дашборды, бэклог, приёмка, обратная связь.</w:t>
       </w:r>
     </w:p>
     <w:p>
@@ -2176,7 +2135,7 @@
           <w:sz w:val="20"/>
           <w:lang w:val="ru-RU"/>
         </w:rPr>
-        <w:t>Коммуникации со стейкхолдерами; материалы о продуктах и достижениях.</w:t>
+        <w:t>Общение с заказчиками, материалы по продуктам и результатам.</w:t>
       </w:r>
     </w:p>
     <w:p>
@@ -2194,7 +2153,7 @@
           <w:sz w:val="20"/>
           <w:lang w:val="ru-RU"/>
         </w:rPr>
-        <w:t>Декабрь 2011 — Август 2016</w:t>
+        <w:t>Декабрь 2011 - Август 2016    4 года 9 месяцев</w:t>
       </w:r>
       <w:r>
         <w:rPr>
@@ -2203,7 +2162,6 @@
           <w:sz w:val="19"/>
           <w:lang w:val="ru-RU"/>
         </w:rPr>
-        <w:t xml:space="preserve">    4 года 9 месяцев</w:t>
       </w:r>
     </w:p>
     <w:p>
@@ -2447,7 +2405,7 @@
           <w:color w:val="222222"/>
           <w:sz w:val="20"/>
         </w:rPr>
-        <w:t>Программа — 1 место IPMA International Project Excellence Award 2015 (Mega-Sized Projects); победа Celent Model Bank 2016 (Legacy Transformation).</w:t>
+        <w:t>Программа - 1 место IPMA International Project Excellence Award 2015 (Mega-Sized Projects); победа Celent Model Bank 2016 (Legacy Transformation).</w:t>
       </w:r>
     </w:p>
     <w:p>
@@ -2587,7 +2545,7 @@
           <w:sz w:val="20"/>
           <w:lang w:val="ru-RU"/>
         </w:rPr>
-        <w:t>Февраль 2010 — Декабрь 2011    1 год 11 месяцев</w:t>
+        <w:t>Февраль 2010 - Декабрь 2011    1 год 11 месяцев</w:t>
       </w:r>
     </w:p>
     <w:p>
@@ -2605,7 +2563,7 @@
           <w:sz w:val="21"/>
           <w:lang w:val="ru-RU"/>
         </w:rPr>
-        <w:t xml:space="preserve">ЗАО «Беллинтегратор» — Менеджер проектов </w:t>
+        <w:t>ЗАО «Беллинтегратор» - Менеджер проектов BI и мониторинга</w:t>
       </w:r>
       <w:r>
         <w:rPr>
@@ -2614,7 +2572,6 @@
           <w:color w:val="222222"/>
           <w:sz w:val="21"/>
         </w:rPr>
-        <w:t>BI</w:t>
       </w:r>
       <w:r>
         <w:rPr>
@@ -2624,7 +2581,6 @@
           <w:sz w:val="21"/>
           <w:lang w:val="ru-RU"/>
         </w:rPr>
-        <w:t xml:space="preserve"> и мониторинга</w:t>
       </w:r>
     </w:p>
     <w:p>
@@ -2727,7 +2683,7 @@
           <w:sz w:val="20"/>
           <w:lang w:val="ru-RU"/>
         </w:rPr>
-        <w:t>Декабрь 2007 — Декабрь 2009    2 года 1 месяц</w:t>
+        <w:t>Декабрь 2007 - Декабрь 2009    2 года 1 месяц</w:t>
       </w:r>
     </w:p>
     <w:p>
@@ -2745,7 +2701,7 @@
           <w:sz w:val="21"/>
           <w:lang w:val="ru-RU"/>
         </w:rPr>
-        <w:t>ЗАО «Верисел Проекты» — Менеджер проектов по системам мониторинга</w:t>
+        <w:t>ЗАО «Верисел Проекты» - Менеджер проектов по системам мониторинга</w:t>
       </w:r>
     </w:p>
     <w:p>
@@ -2814,7 +2770,7 @@
           <w:sz w:val="20"/>
           <w:lang w:val="ru-RU"/>
         </w:rPr>
-        <w:t>Январь 2007 — Декабрь 2007    1 год</w:t>
+        <w:t>Январь 2007 - Декабрь 2007    1 год</w:t>
       </w:r>
     </w:p>
     <w:p>
@@ -2832,7 +2788,7 @@
           <w:sz w:val="21"/>
           <w:lang w:val="ru-RU"/>
         </w:rPr>
-        <w:t>МТС — Руководитель группы развития системы мониторинга (МТС Россия)</w:t>
+        <w:t>МТС - Руководитель группы развития системы мониторинга (МТС Россия)</w:t>
       </w:r>
     </w:p>
     <w:p>
@@ -2918,7 +2874,7 @@
           <w:sz w:val="20"/>
           <w:lang w:val="ru-RU"/>
         </w:rPr>
-        <w:t>Январь 2002 — Январь 2007</w:t>
+        <w:t>Январь 2002 - Январь 2007    5 лет 1 месяц</w:t>
       </w:r>
       <w:r>
         <w:rPr>
@@ -2927,7 +2883,6 @@
           <w:sz w:val="19"/>
           <w:lang w:val="ru-RU"/>
         </w:rPr>
-        <w:t xml:space="preserve">    5 лет 1 месяц</w:t>
       </w:r>
     </w:p>
     <w:p>
@@ -3504,8 +3459,7 @@
           <w:sz w:val="19"/>
           <w:lang w:val="ru-RU"/>
         </w:rPr>
-        <w:lastRenderedPageBreak/>
-        <w:t xml:space="preserve">Институт бизнес-аналитики — </w:t>
+        <w:t>Институт бизнес-аналитики - data-driven навыки, подготовка данных, построение дашбордов</w:t>
       </w:r>
       <w:r>
         <w:rPr>
@@ -3513,7 +3467,6 @@
           <w:color w:val="666666"/>
           <w:sz w:val="19"/>
         </w:rPr>
-        <w:t>data</w:t>
       </w:r>
       <w:r>
         <w:rPr>
@@ -3522,7 +3475,6 @@
           <w:sz w:val="19"/>
           <w:lang w:val="ru-RU"/>
         </w:rPr>
-        <w:t>-</w:t>
       </w:r>
       <w:r>
         <w:rPr>
@@ -3530,7 +3482,6 @@
           <w:color w:val="666666"/>
           <w:sz w:val="19"/>
         </w:rPr>
-        <w:t>driven</w:t>
       </w:r>
       <w:r>
         <w:rPr>
@@ -3539,7 +3490,6 @@
           <w:sz w:val="19"/>
           <w:lang w:val="ru-RU"/>
         </w:rPr>
-        <w:t xml:space="preserve"> навыки, подготовка данных, построение дашбордов</w:t>
       </w:r>
     </w:p>
     <w:p>
@@ -3698,7 +3648,7 @@
           <w:sz w:val="20"/>
           <w:lang w:val="ru-RU"/>
         </w:rPr>
-        <w:t xml:space="preserve">2016  </w:t>
+        <w:t>2016  «Зелёный пояс» - оптимизация бизнес-процессов</w:t>
       </w:r>
       <w:r>
         <w:rPr>
@@ -3708,7 +3658,6 @@
           <w:sz w:val="21"/>
           <w:lang w:val="ru-RU"/>
         </w:rPr>
-        <w:t>«</w:t>
       </w:r>
       <w:proofErr w:type="gramEnd"/>
       <w:r>
@@ -3719,7 +3668,6 @@
           <w:sz w:val="21"/>
           <w:lang w:val="ru-RU"/>
         </w:rPr>
-        <w:t>Зелёный пояс» — оптимизация бизнес-процессов</w:t>
       </w:r>
     </w:p>
     <w:p>
@@ -3755,7 +3703,7 @@
           <w:sz w:val="20"/>
           <w:lang w:val="ru-RU"/>
         </w:rPr>
-        <w:t xml:space="preserve">2015  </w:t>
+        <w:t>2015  Управление проектами - IPMA</w:t>
       </w:r>
       <w:r>
         <w:rPr>
@@ -3765,7 +3713,6 @@
           <w:sz w:val="21"/>
           <w:lang w:val="ru-RU"/>
         </w:rPr>
-        <w:t>Управление</w:t>
       </w:r>
       <w:proofErr w:type="gramEnd"/>
       <w:r>
@@ -3776,7 +3723,6 @@
           <w:sz w:val="21"/>
           <w:lang w:val="ru-RU"/>
         </w:rPr>
-        <w:t xml:space="preserve"> проектами — </w:t>
       </w:r>
       <w:r>
         <w:rPr>
@@ -3785,7 +3731,6 @@
           <w:color w:val="222222"/>
           <w:sz w:val="21"/>
         </w:rPr>
-        <w:t>IPMA</w:t>
       </w:r>
     </w:p>
     <w:p>
@@ -4427,7 +4372,7 @@
           <w:sz w:val="20"/>
           <w:lang w:val="ru-RU"/>
         </w:rPr>
-        <w:t>Русский — Родной</w:t>
+        <w:t>Русский - Родной</w:t>
       </w:r>
     </w:p>
     <w:p>
@@ -4444,24 +4389,22 @@
           <w:sz w:val="20"/>
           <w:lang w:val="ru-RU"/>
         </w:rPr>
-        <w:t xml:space="preserve">Английский — </w:t>
-      </w:r>
-      <w:r>
-        <w:rPr>
-          <w:rFonts w:ascii="Arial" w:eastAsia="Arial" w:hAnsi="Arial"/>
-          <w:color w:val="222222"/>
-          <w:sz w:val="20"/>
-        </w:rPr>
-        <w:t>B</w:t>
-      </w:r>
-      <w:r>
-        <w:rPr>
-          <w:rFonts w:ascii="Arial" w:eastAsia="Arial" w:hAnsi="Arial"/>
-          <w:color w:val="222222"/>
-          <w:sz w:val="20"/>
-          <w:lang w:val="ru-RU"/>
-        </w:rPr>
-        <w:t>2 — Средне-продвинутый</w:t>
+        <w:t>Английский - B2 - Средне-продвинутый</w:t>
+      </w:r>
+      <w:r>
+        <w:rPr>
+          <w:rFonts w:ascii="Arial" w:eastAsia="Arial" w:hAnsi="Arial"/>
+          <w:color w:val="222222"/>
+          <w:sz w:val="20"/>
+        </w:rPr>
+      </w:r>
+      <w:r>
+        <w:rPr>
+          <w:rFonts w:ascii="Arial" w:eastAsia="Arial" w:hAnsi="Arial"/>
+          <w:color w:val="222222"/>
+          <w:sz w:val="20"/>
+          <w:lang w:val="ru-RU"/>
+        </w:rPr>
       </w:r>
     </w:p>
     <w:p>
@@ -4940,7 +4883,7 @@
           <w:sz w:val="21"/>
           <w:lang w:val="ru-RU"/>
         </w:rPr>
-        <w:t xml:space="preserve">Развиваюсь как владелец продукта в зоне </w:t>
+        <w:t>В Сбере делал дашборды и отчётность (в том числе CSI и мониторинг инициатив), сам предлагал такие экраны. В Axenix - управленческая отчётность и BI. В ПСБ - хранилище, витрины, согласование с архитектурой и ИБ.</w:t>
       </w:r>
       <w:r>
         <w:rPr>
@@ -4948,7 +4891,6 @@
           <w:color w:val="222222"/>
           <w:sz w:val="21"/>
         </w:rPr>
-        <w:t>BI</w:t>
       </w:r>
       <w:r>
         <w:rPr>
@@ -4957,7 +4899,6 @@
           <w:sz w:val="21"/>
           <w:lang w:val="ru-RU"/>
         </w:rPr>
-        <w:t xml:space="preserve"> и мониторинга процессов данных: потребность → метрики и подход → дашборд → обратная связь и следующий инкремент. В </w:t>
       </w:r>
       <w:r>
         <w:rPr>
@@ -4965,7 +4906,6 @@
           <w:color w:val="222222"/>
           <w:sz w:val="21"/>
         </w:rPr>
-        <w:t>Axenix</w:t>
       </w:r>
       <w:r>
         <w:rPr>
@@ -4974,7 +4914,6 @@
           <w:sz w:val="21"/>
           <w:lang w:val="ru-RU"/>
         </w:rPr>
-        <w:t xml:space="preserve"> — системы управленческой отчётности и </w:t>
       </w:r>
       <w:r>
         <w:rPr>
@@ -4982,7 +4921,6 @@
           <w:color w:val="222222"/>
           <w:sz w:val="21"/>
         </w:rPr>
-        <w:t>BI</w:t>
       </w:r>
       <w:r>
         <w:rPr>
@@ -4991,7 +4929,6 @@
           <w:sz w:val="21"/>
           <w:lang w:val="ru-RU"/>
         </w:rPr>
-        <w:t xml:space="preserve">; в ПСБ — расширение компетенции на платформу данных: </w:t>
       </w:r>
       <w:r>
         <w:rPr>
@@ -4999,7 +4936,6 @@
           <w:color w:val="222222"/>
           <w:sz w:val="21"/>
         </w:rPr>
-        <w:t>DWH</w:t>
       </w:r>
       <w:r>
         <w:rPr>
@@ -5008,7 +4944,6 @@
           <w:sz w:val="21"/>
           <w:lang w:val="ru-RU"/>
         </w:rPr>
-        <w:t xml:space="preserve">, контуры загрузки, архитектура, ИБ, </w:t>
       </w:r>
       <w:r>
         <w:rPr>
@@ -5016,7 +4951,6 @@
           <w:color w:val="222222"/>
           <w:sz w:val="21"/>
         </w:rPr>
-        <w:t>CI</w:t>
       </w:r>
       <w:r>
         <w:rPr>
@@ -5025,7 +4959,6 @@
           <w:sz w:val="21"/>
           <w:lang w:val="ru-RU"/>
         </w:rPr>
-        <w:t>/</w:t>
       </w:r>
       <w:r>
         <w:rPr>
@@ -5033,7 +4966,6 @@
           <w:color w:val="222222"/>
           <w:sz w:val="21"/>
         </w:rPr>
-        <w:t>CD</w:t>
       </w:r>
       <w:r>
         <w:rPr>
@@ -5042,7 +4974,6 @@
           <w:sz w:val="21"/>
           <w:lang w:val="ru-RU"/>
         </w:rPr>
-        <w:t xml:space="preserve">, команда, ресурсы, закупки. Опыт </w:t>
       </w:r>
       <w:r>
         <w:rPr>
@@ -5050,7 +4981,6 @@
           <w:color w:val="222222"/>
           <w:sz w:val="21"/>
         </w:rPr>
-        <w:t>CSI</w:t>
       </w:r>
       <w:r>
         <w:rPr>
@@ -5059,7 +4989,6 @@
           <w:sz w:val="21"/>
           <w:lang w:val="ru-RU"/>
         </w:rPr>
-        <w:t xml:space="preserve"> и </w:t>
       </w:r>
       <w:r>
         <w:rPr>
@@ -5067,7 +4996,6 @@
           <w:color w:val="222222"/>
           <w:sz w:val="21"/>
         </w:rPr>
-        <w:t>End</w:t>
       </w:r>
       <w:r>
         <w:rPr>
@@ -5076,7 +5004,6 @@
           <w:sz w:val="21"/>
           <w:lang w:val="ru-RU"/>
         </w:rPr>
-        <w:t>-</w:t>
       </w:r>
       <w:r>
         <w:rPr>
@@ -5084,7 +5011,6 @@
           <w:color w:val="222222"/>
           <w:sz w:val="21"/>
         </w:rPr>
-        <w:t>to</w:t>
       </w:r>
       <w:r>
         <w:rPr>
@@ -5093,7 +5019,6 @@
           <w:sz w:val="21"/>
           <w:lang w:val="ru-RU"/>
         </w:rPr>
-        <w:t>-</w:t>
       </w:r>
       <w:r>
         <w:rPr>
@@ -5101,7 +5026,6 @@
           <w:color w:val="222222"/>
           <w:sz w:val="21"/>
         </w:rPr>
-        <w:t>End</w:t>
       </w:r>
       <w:r>
         <w:rPr>
@@ -5110,7 +5034,6 @@
           <w:sz w:val="21"/>
           <w:lang w:val="ru-RU"/>
         </w:rPr>
-        <w:t xml:space="preserve"> мониторинга процессов в </w:t>
       </w:r>
       <w:r>
         <w:rPr>
@@ -5118,7 +5041,6 @@
           <w:color w:val="222222"/>
           <w:sz w:val="21"/>
         </w:rPr>
-        <w:t>SberData</w:t>
       </w:r>
       <w:r>
         <w:rPr>
@@ -5127,7 +5049,6 @@
           <w:sz w:val="21"/>
           <w:lang w:val="ru-RU"/>
         </w:rPr>
-        <w:t>; системы мониторинга в телекоме.</w:t>
       </w:r>
     </w:p>
     <w:p>
@@ -5144,8 +5065,7 @@
           <w:sz w:val="21"/>
           <w:lang w:val="ru-RU"/>
         </w:rPr>
-        <w:lastRenderedPageBreak/>
-        <w:t>Коммуникабельный, ответственный, самостоятельный. Быстро обучаюсь, постоянно повышаю профессиональный уровень. Умение работать с людьми и доводить продукт до видимого результата для пользователей.</w:t>
+        <w:t>Привык доводить работу до результата, с которым можно жить каждый день, а не до отчёта «для галочки».</w:t>
       </w:r>
     </w:p>
     <w:sectPr>

</xml_diff>